<commit_message>
docs: add document versioning workflow and clean lecture docs
</commit_message>
<xml_diff>
--- a/docs/presentation/ai-study-课堂展示讲义-v0.3.docx
+++ b/docs/presentation/ai-study-课堂展示讲义-v0.3.docx
@@ -3615,7 +3615,616 @@
         <w:pStyle w:val="Heading1"/>
       </w:pPr>
       <w:r>
-        <w:t>12. 第一周先做什么</w:t>
+        <w:t>12. 每个人到底领取哪些文档</w:t>
+      </w:r>
+    </w:p>
+    <w:p>
+      <w:pPr>
+        <w:spacing w:after="120"/>
+      </w:pPr>
+      <w:r>
+        <w:rPr>
+          <w:rFonts w:ascii="Microsoft YaHei" w:hAnsi="Microsoft YaHei" w:eastAsia="Microsoft YaHei"/>
+          <w:b w:val="0"/>
+          <w:sz w:val="21"/>
+        </w:rPr>
+        <w:t>这里要特别说清楚：每位同学不是只领取自己的角色文档。</w:t>
+      </w:r>
+    </w:p>
+    <w:p>
+      <w:pPr>
+        <w:spacing w:after="120"/>
+      </w:pPr>
+      <w:r>
+        <w:rPr>
+          <w:rFonts w:ascii="Microsoft YaHei" w:hAnsi="Microsoft YaHei" w:eastAsia="Microsoft YaHei"/>
+          <w:b w:val="0"/>
+          <w:sz w:val="21"/>
+        </w:rPr>
+        <w:t>如果只看自己的文档，就像只拿到一块拼图，不知道整张图长什么样。最后每个人都写了东西，但接口对不上、页面接不上、演示串不起来。</w:t>
+      </w:r>
+    </w:p>
+    <w:p>
+      <w:pPr>
+        <w:spacing w:after="120"/>
+      </w:pPr>
+      <w:r>
+        <w:rPr>
+          <w:rFonts w:ascii="Microsoft YaHei" w:hAnsi="Microsoft YaHei" w:eastAsia="Microsoft YaHei"/>
+          <w:b w:val="0"/>
+          <w:sz w:val="21"/>
+        </w:rPr>
+        <w:t>所以每位同学的阅读顺序是：</w:t>
+      </w:r>
+    </w:p>
+    <w:tbl>
+      <w:tblPr>
+        <w:tblStyle w:val="TableGrid"/>
+        <w:tblW w:type="dxa" w:w="9360"/>
+        <w:jc w:val="center"/>
+        <w:tblLayout w:type="fixed"/>
+        <w:tblLook w:firstColumn="1" w:firstRow="1" w:lastColumn="0" w:lastRow="0" w:noHBand="0" w:noVBand="1" w:val="04A0"/>
+      </w:tblPr>
+      <w:tblGrid>
+        <w:gridCol w:w="3120"/>
+        <w:gridCol w:w="3120"/>
+        <w:gridCol w:w="3120"/>
+      </w:tblGrid>
+      <w:tr>
+        <w:tc>
+          <w:tcPr>
+            <w:tcW w:type="dxa" w:w="3120"/>
+            <w:shd w:val="clear" w:color="auto" w:fill="E8EEF5"/>
+          </w:tcPr>
+          <w:p>
+            <w:pPr>
+              <w:spacing w:after="0"/>
+            </w:pPr>
+            <w:r>
+              <w:rPr>
+                <w:rFonts w:ascii="Microsoft YaHei" w:hAnsi="Microsoft YaHei" w:eastAsia="Microsoft YaHei"/>
+                <w:b/>
+                <w:color w:val="1F4D78"/>
+                <w:sz w:val="19"/>
+              </w:rPr>
+              <w:t>顺序</w:t>
+            </w:r>
+          </w:p>
+        </w:tc>
+        <w:tc>
+          <w:tcPr>
+            <w:tcW w:type="dxa" w:w="3120"/>
+            <w:shd w:val="clear" w:color="auto" w:fill="E8EEF5"/>
+          </w:tcPr>
+          <w:p>
+            <w:pPr>
+              <w:spacing w:after="0"/>
+            </w:pPr>
+            <w:r>
+              <w:rPr>
+                <w:rFonts w:ascii="Microsoft YaHei" w:hAnsi="Microsoft YaHei" w:eastAsia="Microsoft YaHei"/>
+                <w:b/>
+                <w:color w:val="1F4D78"/>
+                <w:sz w:val="19"/>
+              </w:rPr>
+              <w:t>要看的文档</w:t>
+            </w:r>
+          </w:p>
+        </w:tc>
+        <w:tc>
+          <w:tcPr>
+            <w:tcW w:type="dxa" w:w="3120"/>
+            <w:shd w:val="clear" w:color="auto" w:fill="E8EEF5"/>
+          </w:tcPr>
+          <w:p>
+            <w:pPr>
+              <w:spacing w:after="0"/>
+            </w:pPr>
+            <w:r>
+              <w:rPr>
+                <w:rFonts w:ascii="Microsoft YaHei" w:hAnsi="Microsoft YaHei" w:eastAsia="Microsoft YaHei"/>
+                <w:b/>
+                <w:color w:val="1F4D78"/>
+                <w:sz w:val="19"/>
+              </w:rPr>
+              <w:t>为什么要看</w:t>
+            </w:r>
+          </w:p>
+        </w:tc>
+      </w:tr>
+      <w:tr>
+        <w:tc>
+          <w:tcPr>
+            <w:tcW w:type="dxa" w:w="3120"/>
+            <w:vAlign w:val="center"/>
+          </w:tcPr>
+          <w:p>
+            <w:pPr>
+              <w:spacing w:after="0"/>
+            </w:pPr>
+            <w:r>
+              <w:rPr>
+                <w:rFonts w:ascii="Microsoft YaHei" w:hAnsi="Microsoft YaHei" w:eastAsia="Microsoft YaHei"/>
+                <w:b w:val="0"/>
+                <w:sz w:val="18"/>
+              </w:rPr>
+              <w:t>1</w:t>
+            </w:r>
+          </w:p>
+        </w:tc>
+        <w:tc>
+          <w:tcPr>
+            <w:tcW w:type="dxa" w:w="3120"/>
+            <w:vAlign w:val="center"/>
+          </w:tcPr>
+          <w:p>
+            <w:pPr>
+              <w:spacing w:after="0"/>
+            </w:pPr>
+            <w:r>
+              <w:rPr>
+                <w:rFonts w:ascii="Microsoft YaHei" w:hAnsi="Microsoft YaHei" w:eastAsia="Microsoft YaHei"/>
+                <w:b w:val="0"/>
+                <w:sz w:val="18"/>
+              </w:rPr>
+              <w:t>README</w:t>
+            </w:r>
+          </w:p>
+        </w:tc>
+        <w:tc>
+          <w:tcPr>
+            <w:tcW w:type="dxa" w:w="3120"/>
+            <w:vAlign w:val="center"/>
+          </w:tcPr>
+          <w:p>
+            <w:pPr>
+              <w:spacing w:after="0"/>
+            </w:pPr>
+            <w:r>
+              <w:rPr>
+                <w:rFonts w:ascii="Microsoft YaHei" w:hAnsi="Microsoft YaHei" w:eastAsia="Microsoft YaHei"/>
+                <w:b w:val="0"/>
+                <w:sz w:val="18"/>
+              </w:rPr>
+              <w:t>知道仓库入口和所有文档在哪里</w:t>
+            </w:r>
+          </w:p>
+        </w:tc>
+      </w:tr>
+      <w:tr>
+        <w:tc>
+          <w:tcPr>
+            <w:tcW w:type="dxa" w:w="3120"/>
+            <w:vAlign w:val="center"/>
+          </w:tcPr>
+          <w:p>
+            <w:pPr>
+              <w:spacing w:after="0"/>
+            </w:pPr>
+            <w:r>
+              <w:rPr>
+                <w:rFonts w:ascii="Microsoft YaHei" w:hAnsi="Microsoft YaHei" w:eastAsia="Microsoft YaHei"/>
+                <w:b w:val="0"/>
+                <w:sz w:val="18"/>
+              </w:rPr>
+              <w:t>2</w:t>
+            </w:r>
+          </w:p>
+        </w:tc>
+        <w:tc>
+          <w:tcPr>
+            <w:tcW w:type="dxa" w:w="3120"/>
+            <w:vAlign w:val="center"/>
+          </w:tcPr>
+          <w:p>
+            <w:pPr>
+              <w:spacing w:after="0"/>
+            </w:pPr>
+            <w:r>
+              <w:rPr>
+                <w:rFonts w:ascii="Microsoft YaHei" w:hAnsi="Microsoft YaHei" w:eastAsia="Microsoft YaHei"/>
+                <w:b w:val="0"/>
+                <w:sz w:val="18"/>
+              </w:rPr>
+              <w:t>总 PRD、架构与协作规则</w:t>
+            </w:r>
+          </w:p>
+        </w:tc>
+        <w:tc>
+          <w:tcPr>
+            <w:tcW w:type="dxa" w:w="3120"/>
+            <w:vAlign w:val="center"/>
+          </w:tcPr>
+          <w:p>
+            <w:pPr>
+              <w:spacing w:after="0"/>
+            </w:pPr>
+            <w:r>
+              <w:rPr>
+                <w:rFonts w:ascii="Microsoft YaHei" w:hAnsi="Microsoft YaHei" w:eastAsia="Microsoft YaHei"/>
+                <w:b w:val="0"/>
+                <w:sz w:val="18"/>
+              </w:rPr>
+              <w:t>知道整个项目要做成什么</w:t>
+            </w:r>
+          </w:p>
+        </w:tc>
+      </w:tr>
+      <w:tr>
+        <w:tc>
+          <w:tcPr>
+            <w:tcW w:type="dxa" w:w="3120"/>
+            <w:vAlign w:val="center"/>
+          </w:tcPr>
+          <w:p>
+            <w:pPr>
+              <w:spacing w:after="0"/>
+            </w:pPr>
+            <w:r>
+              <w:rPr>
+                <w:rFonts w:ascii="Microsoft YaHei" w:hAnsi="Microsoft YaHei" w:eastAsia="Microsoft YaHei"/>
+                <w:b w:val="0"/>
+                <w:sz w:val="18"/>
+              </w:rPr>
+              <w:t>3</w:t>
+            </w:r>
+          </w:p>
+        </w:tc>
+        <w:tc>
+          <w:tcPr>
+            <w:tcW w:type="dxa" w:w="3120"/>
+            <w:vAlign w:val="center"/>
+          </w:tcPr>
+          <w:p>
+            <w:pPr>
+              <w:spacing w:after="0"/>
+            </w:pPr>
+            <w:r>
+              <w:rPr>
+                <w:rFonts w:ascii="Microsoft YaHei" w:hAnsi="Microsoft YaHei" w:eastAsia="Microsoft YaHei"/>
+                <w:b w:val="0"/>
+                <w:sz w:val="18"/>
+              </w:rPr>
+              <w:t>课堂展示讲义</w:t>
+            </w:r>
+          </w:p>
+        </w:tc>
+        <w:tc>
+          <w:tcPr>
+            <w:tcW w:type="dxa" w:w="3120"/>
+            <w:vAlign w:val="center"/>
+          </w:tcPr>
+          <w:p>
+            <w:pPr>
+              <w:spacing w:after="0"/>
+            </w:pPr>
+            <w:r>
+              <w:rPr>
+                <w:rFonts w:ascii="Microsoft YaHei" w:hAnsi="Microsoft YaHei" w:eastAsia="Microsoft YaHei"/>
+                <w:b w:val="0"/>
+                <w:sz w:val="18"/>
+              </w:rPr>
+              <w:t>和老师课堂讲解保持同一个理解</w:t>
+            </w:r>
+          </w:p>
+        </w:tc>
+      </w:tr>
+      <w:tr>
+        <w:tc>
+          <w:tcPr>
+            <w:tcW w:type="dxa" w:w="3120"/>
+            <w:vAlign w:val="center"/>
+          </w:tcPr>
+          <w:p>
+            <w:pPr>
+              <w:spacing w:after="0"/>
+            </w:pPr>
+            <w:r>
+              <w:rPr>
+                <w:rFonts w:ascii="Microsoft YaHei" w:hAnsi="Microsoft YaHei" w:eastAsia="Microsoft YaHei"/>
+                <w:b w:val="0"/>
+                <w:sz w:val="18"/>
+              </w:rPr>
+              <w:t>4</w:t>
+            </w:r>
+          </w:p>
+        </w:tc>
+        <w:tc>
+          <w:tcPr>
+            <w:tcW w:type="dxa" w:w="3120"/>
+            <w:vAlign w:val="center"/>
+          </w:tcPr>
+          <w:p>
+            <w:pPr>
+              <w:spacing w:after="0"/>
+            </w:pPr>
+            <w:r>
+              <w:rPr>
+                <w:rFonts w:ascii="Microsoft YaHei" w:hAnsi="Microsoft YaHei" w:eastAsia="Microsoft YaHei"/>
+                <w:b w:val="0"/>
+                <w:sz w:val="18"/>
+              </w:rPr>
+              <w:t>技术栈与架构学习指南</w:t>
+            </w:r>
+          </w:p>
+        </w:tc>
+        <w:tc>
+          <w:tcPr>
+            <w:tcW w:type="dxa" w:w="3120"/>
+            <w:vAlign w:val="center"/>
+          </w:tcPr>
+          <w:p>
+            <w:pPr>
+              <w:spacing w:after="0"/>
+            </w:pPr>
+            <w:r>
+              <w:rPr>
+                <w:rFonts w:ascii="Microsoft YaHei" w:hAnsi="Microsoft YaHei" w:eastAsia="Microsoft YaHei"/>
+                <w:b w:val="0"/>
+                <w:sz w:val="18"/>
+              </w:rPr>
+              <w:t>知道为什么选 React、FastAPI、SQLite、LangGraph</w:t>
+            </w:r>
+          </w:p>
+        </w:tc>
+      </w:tr>
+      <w:tr>
+        <w:tc>
+          <w:tcPr>
+            <w:tcW w:type="dxa" w:w="3120"/>
+            <w:vAlign w:val="center"/>
+          </w:tcPr>
+          <w:p>
+            <w:pPr>
+              <w:spacing w:after="0"/>
+            </w:pPr>
+            <w:r>
+              <w:rPr>
+                <w:rFonts w:ascii="Microsoft YaHei" w:hAnsi="Microsoft YaHei" w:eastAsia="Microsoft YaHei"/>
+                <w:b w:val="0"/>
+                <w:sz w:val="18"/>
+              </w:rPr>
+              <w:t>5</w:t>
+            </w:r>
+          </w:p>
+        </w:tc>
+        <w:tc>
+          <w:tcPr>
+            <w:tcW w:type="dxa" w:w="3120"/>
+            <w:vAlign w:val="center"/>
+          </w:tcPr>
+          <w:p>
+            <w:pPr>
+              <w:spacing w:after="0"/>
+            </w:pPr>
+            <w:r>
+              <w:rPr>
+                <w:rFonts w:ascii="Microsoft YaHei" w:hAnsi="Microsoft YaHei" w:eastAsia="Microsoft YaHei"/>
+                <w:b w:val="0"/>
+                <w:sz w:val="18"/>
+              </w:rPr>
+              <w:t>文档领取、版本升级流程</w:t>
+            </w:r>
+          </w:p>
+        </w:tc>
+        <w:tc>
+          <w:tcPr>
+            <w:tcW w:type="dxa" w:w="3120"/>
+            <w:vAlign w:val="center"/>
+          </w:tcPr>
+          <w:p>
+            <w:pPr>
+              <w:spacing w:after="0"/>
+            </w:pPr>
+            <w:r>
+              <w:rPr>
+                <w:rFonts w:ascii="Microsoft YaHei" w:hAnsi="Microsoft YaHei" w:eastAsia="Microsoft YaHei"/>
+                <w:b w:val="0"/>
+                <w:sz w:val="18"/>
+              </w:rPr>
+              <w:t>知道怎么领任务、怎么提交方案、课后怎么改版</w:t>
+            </w:r>
+          </w:p>
+        </w:tc>
+      </w:tr>
+      <w:tr>
+        <w:tc>
+          <w:tcPr>
+            <w:tcW w:type="dxa" w:w="3120"/>
+            <w:vAlign w:val="center"/>
+          </w:tcPr>
+          <w:p>
+            <w:pPr>
+              <w:spacing w:after="0"/>
+            </w:pPr>
+            <w:r>
+              <w:rPr>
+                <w:rFonts w:ascii="Microsoft YaHei" w:hAnsi="Microsoft YaHei" w:eastAsia="Microsoft YaHei"/>
+                <w:b w:val="0"/>
+                <w:sz w:val="18"/>
+              </w:rPr>
+              <w:t>6</w:t>
+            </w:r>
+          </w:p>
+        </w:tc>
+        <w:tc>
+          <w:tcPr>
+            <w:tcW w:type="dxa" w:w="3120"/>
+            <w:vAlign w:val="center"/>
+          </w:tcPr>
+          <w:p>
+            <w:pPr>
+              <w:spacing w:after="0"/>
+            </w:pPr>
+            <w:r>
+              <w:rPr>
+                <w:rFonts w:ascii="Microsoft YaHei" w:hAnsi="Microsoft YaHei" w:eastAsia="Microsoft YaHei"/>
+                <w:b w:val="0"/>
+                <w:sz w:val="18"/>
+              </w:rPr>
+              <w:t>Git 协作规范</w:t>
+            </w:r>
+          </w:p>
+        </w:tc>
+        <w:tc>
+          <w:tcPr>
+            <w:tcW w:type="dxa" w:w="3120"/>
+            <w:vAlign w:val="center"/>
+          </w:tcPr>
+          <w:p>
+            <w:pPr>
+              <w:spacing w:after="0"/>
+            </w:pPr>
+            <w:r>
+              <w:rPr>
+                <w:rFonts w:ascii="Microsoft YaHei" w:hAnsi="Microsoft YaHei" w:eastAsia="Microsoft YaHei"/>
+                <w:b w:val="0"/>
+                <w:sz w:val="18"/>
+              </w:rPr>
+              <w:t>知道怎么拉分支、提交、合并</w:t>
+            </w:r>
+          </w:p>
+        </w:tc>
+      </w:tr>
+      <w:tr>
+        <w:tc>
+          <w:tcPr>
+            <w:tcW w:type="dxa" w:w="3120"/>
+            <w:vAlign w:val="center"/>
+          </w:tcPr>
+          <w:p>
+            <w:pPr>
+              <w:spacing w:after="0"/>
+            </w:pPr>
+            <w:r>
+              <w:rPr>
+                <w:rFonts w:ascii="Microsoft YaHei" w:hAnsi="Microsoft YaHei" w:eastAsia="Microsoft YaHei"/>
+                <w:b w:val="0"/>
+                <w:sz w:val="18"/>
+              </w:rPr>
+              <w:t>7</w:t>
+            </w:r>
+          </w:p>
+        </w:tc>
+        <w:tc>
+          <w:tcPr>
+            <w:tcW w:type="dxa" w:w="3120"/>
+            <w:vAlign w:val="center"/>
+          </w:tcPr>
+          <w:p>
+            <w:pPr>
+              <w:spacing w:after="0"/>
+            </w:pPr>
+            <w:r>
+              <w:rPr>
+                <w:rFonts w:ascii="Microsoft YaHei" w:hAnsi="Microsoft YaHei" w:eastAsia="Microsoft YaHei"/>
+                <w:b w:val="0"/>
+                <w:sz w:val="18"/>
+              </w:rPr>
+              <w:t>OpenAPI 接口契约</w:t>
+            </w:r>
+          </w:p>
+        </w:tc>
+        <w:tc>
+          <w:tcPr>
+            <w:tcW w:type="dxa" w:w="3120"/>
+            <w:vAlign w:val="center"/>
+          </w:tcPr>
+          <w:p>
+            <w:pPr>
+              <w:spacing w:after="0"/>
+            </w:pPr>
+            <w:r>
+              <w:rPr>
+                <w:rFonts w:ascii="Microsoft YaHei" w:hAnsi="Microsoft YaHei" w:eastAsia="Microsoft YaHei"/>
+                <w:b w:val="0"/>
+                <w:sz w:val="18"/>
+              </w:rPr>
+              <w:t>知道前后端怎么对接</w:t>
+            </w:r>
+          </w:p>
+        </w:tc>
+      </w:tr>
+      <w:tr>
+        <w:tc>
+          <w:tcPr>
+            <w:tcW w:type="dxa" w:w="3120"/>
+            <w:vAlign w:val="center"/>
+          </w:tcPr>
+          <w:p>
+            <w:pPr>
+              <w:spacing w:after="0"/>
+            </w:pPr>
+            <w:r>
+              <w:rPr>
+                <w:rFonts w:ascii="Microsoft YaHei" w:hAnsi="Microsoft YaHei" w:eastAsia="Microsoft YaHei"/>
+                <w:b w:val="0"/>
+                <w:sz w:val="18"/>
+              </w:rPr>
+              <w:t>8</w:t>
+            </w:r>
+          </w:p>
+        </w:tc>
+        <w:tc>
+          <w:tcPr>
+            <w:tcW w:type="dxa" w:w="3120"/>
+            <w:vAlign w:val="center"/>
+          </w:tcPr>
+          <w:p>
+            <w:pPr>
+              <w:spacing w:after="0"/>
+            </w:pPr>
+            <w:r>
+              <w:rPr>
+                <w:rFonts w:ascii="Microsoft YaHei" w:hAnsi="Microsoft YaHei" w:eastAsia="Microsoft YaHei"/>
+                <w:b w:val="0"/>
+                <w:sz w:val="18"/>
+              </w:rPr>
+              <w:t>自己的角色文档</w:t>
+            </w:r>
+          </w:p>
+        </w:tc>
+        <w:tc>
+          <w:tcPr>
+            <w:tcW w:type="dxa" w:w="3120"/>
+            <w:vAlign w:val="center"/>
+          </w:tcPr>
+          <w:p>
+            <w:pPr>
+              <w:spacing w:after="0"/>
+            </w:pPr>
+            <w:r>
+              <w:rPr>
+                <w:rFonts w:ascii="Microsoft YaHei" w:hAnsi="Microsoft YaHei" w:eastAsia="Microsoft YaHei"/>
+                <w:b w:val="0"/>
+                <w:sz w:val="18"/>
+              </w:rPr>
+              <w:t>知道自己第一周具体交什么</w:t>
+            </w:r>
+          </w:p>
+        </w:tc>
+      </w:tr>
+    </w:tbl>
+    <w:p/>
+    <w:p>
+      <w:pPr>
+        <w:spacing w:after="120"/>
+      </w:pPr>
+      <w:r>
+        <w:rPr>
+          <w:rFonts w:ascii="Microsoft YaHei" w:hAnsi="Microsoft YaHei" w:eastAsia="Microsoft YaHei"/>
+          <w:b w:val="0"/>
+          <w:sz w:val="21"/>
+        </w:rPr>
+        <w:t>角色文档是“你的施工图”，总文档和规则是“全组的地图”。两类都要看。</w:t>
+      </w:r>
+    </w:p>
+    <w:p>
+      <w:pPr>
+        <w:pStyle w:val="Heading1"/>
+      </w:pPr>
+      <w:r>
+        <w:t>13. 第一周先做什么</w:t>
       </w:r>
     </w:p>
     <w:p>
@@ -3905,7 +4514,7 @@
         <w:pStyle w:val="Heading1"/>
       </w:pPr>
       <w:r>
-        <w:t>13. 今天每位同学的创意怎么讲</w:t>
+        <w:t>14. 今天每位同学的创意怎么讲</w:t>
       </w:r>
     </w:p>
     <w:p>
@@ -4195,7 +4804,7 @@
         <w:pStyle w:val="Heading1"/>
       </w:pPr>
       <w:r>
-        <w:t>14. 今天下课前要确认</w:t>
+        <w:t>15. 今天下课前要确认</w:t>
       </w:r>
     </w:p>
     <w:p>
@@ -4298,10 +4907,155 @@
     </w:p>
     <w:p>
       <w:pPr>
+        <w:pStyle w:val="ListBullet"/>
+        <w:spacing w:after="80"/>
+      </w:pPr>
+      <w:r>
+        <w:rPr>
+          <w:rFonts w:ascii="Microsoft YaHei" w:hAnsi="Microsoft YaHei" w:eastAsia="Microsoft YaHei"/>
+          <w:b w:val="0"/>
+          <w:sz w:val="21"/>
+        </w:rPr>
+        <w:t>每位同学已经知道要读哪些全组文档和自己的角色文档。</w:t>
+      </w:r>
+    </w:p>
+    <w:p>
+      <w:pPr>
+        <w:pStyle w:val="ListBullet"/>
+        <w:spacing w:after="80"/>
+      </w:pPr>
+      <w:r>
+        <w:rPr>
+          <w:rFonts w:ascii="Microsoft YaHei" w:hAnsi="Microsoft YaHei" w:eastAsia="Microsoft YaHei"/>
+          <w:b w:val="0"/>
+          <w:sz w:val="21"/>
+        </w:rPr>
+        <w:t>每位同学的创意方案按模板提交，方便老师课后筛选。</w:t>
+      </w:r>
+    </w:p>
+    <w:p>
+      <w:pPr>
         <w:pStyle w:val="Heading1"/>
       </w:pPr>
       <w:r>
-        <w:t>15. 这节课最后记住三句话</w:t>
+        <w:t>16. 课后会怎么升级版本</w:t>
+      </w:r>
+    </w:p>
+    <w:p>
+      <w:pPr>
+        <w:spacing w:after="120"/>
+      </w:pPr>
+      <w:r>
+        <w:rPr>
+          <w:rFonts w:ascii="Microsoft YaHei" w:hAnsi="Microsoft YaHei" w:eastAsia="Microsoft YaHei"/>
+          <w:b w:val="0"/>
+          <w:sz w:val="21"/>
+        </w:rPr>
+        <w:t>现在这套文档是课前讨论版。等我看完大家的创意方案后，会把方案统一整理成最终版本。</w:t>
+      </w:r>
+    </w:p>
+    <w:p>
+      <w:pPr>
+        <w:spacing w:after="120"/>
+      </w:pPr>
+      <w:r>
+        <w:rPr>
+          <w:rFonts w:ascii="Microsoft YaHei" w:hAnsi="Microsoft YaHei" w:eastAsia="Microsoft YaHei"/>
+          <w:b w:val="0"/>
+          <w:sz w:val="21"/>
+        </w:rPr>
+        <w:t>升级时不是随便改几句话，而是按顺序改：</w:t>
+      </w:r>
+    </w:p>
+    <w:p>
+      <w:pPr>
+        <w:pStyle w:val="ListNumber"/>
+        <w:spacing w:after="80"/>
+      </w:pPr>
+      <w:r>
+        <w:rPr>
+          <w:rFonts w:ascii="Microsoft YaHei" w:hAnsi="Microsoft YaHei" w:eastAsia="Microsoft YaHei"/>
+          <w:b w:val="0"/>
+          <w:sz w:val="21"/>
+        </w:rPr>
+        <w:t>先记录哪些创意采纳、延期、暂不做。</w:t>
+      </w:r>
+    </w:p>
+    <w:p>
+      <w:pPr>
+        <w:pStyle w:val="ListNumber"/>
+        <w:spacing w:after="80"/>
+      </w:pPr>
+      <w:r>
+        <w:rPr>
+          <w:rFonts w:ascii="Microsoft YaHei" w:hAnsi="Microsoft YaHei" w:eastAsia="Microsoft YaHei"/>
+          <w:b w:val="0"/>
+          <w:sz w:val="21"/>
+        </w:rPr>
+        <w:t>再更新总 PRD。</w:t>
+      </w:r>
+    </w:p>
+    <w:p>
+      <w:pPr>
+        <w:pStyle w:val="ListNumber"/>
+        <w:spacing w:after="80"/>
+      </w:pPr>
+      <w:r>
+        <w:rPr>
+          <w:rFonts w:ascii="Microsoft YaHei" w:hAnsi="Microsoft YaHei" w:eastAsia="Microsoft YaHei"/>
+          <w:b w:val="0"/>
+          <w:sz w:val="21"/>
+        </w:rPr>
+        <w:t>再更新 A-E 每个人的执行文档。</w:t>
+      </w:r>
+    </w:p>
+    <w:p>
+      <w:pPr>
+        <w:pStyle w:val="ListNumber"/>
+        <w:spacing w:after="80"/>
+      </w:pPr>
+      <w:r>
+        <w:rPr>
+          <w:rFonts w:ascii="Microsoft YaHei" w:hAnsi="Microsoft YaHei" w:eastAsia="Microsoft YaHei"/>
+          <w:b w:val="0"/>
+          <w:sz w:val="21"/>
+        </w:rPr>
+        <w:t>如果接口变化，先更新 OpenAPI。</w:t>
+      </w:r>
+    </w:p>
+    <w:p>
+      <w:pPr>
+        <w:pStyle w:val="ListNumber"/>
+        <w:spacing w:after="80"/>
+      </w:pPr>
+      <w:r>
+        <w:rPr>
+          <w:rFonts w:ascii="Microsoft YaHei" w:hAnsi="Microsoft YaHei" w:eastAsia="Microsoft YaHei"/>
+          <w:b w:val="0"/>
+          <w:sz w:val="21"/>
+        </w:rPr>
+        <w:t>最后重新生成 Word 讲义，保证课堂展示和开发执行是同一套说法。</w:t>
+      </w:r>
+    </w:p>
+    <w:p>
+      <w:pPr>
+        <w:spacing w:after="120"/>
+      </w:pPr>
+      <w:r>
+        <w:rPr>
+          <w:rFonts w:ascii="Microsoft YaHei" w:hAnsi="Microsoft YaHei" w:eastAsia="Microsoft YaHei"/>
+          <w:b w:val="0"/>
+          <w:sz w:val="21"/>
+        </w:rPr>
+        <w:t>这样做是为了让创意有空间，也让开发不混乱。</w:t>
+      </w:r>
+    </w:p>
+    <w:p>
+      <w:pPr>
+        <w:pStyle w:val="Heading1"/>
+      </w:pPr>
+      <w:r>
+        <w:t>17. 这节课最后记住三句话</w:t>
       </w:r>
     </w:p>
     <w:p>

</xml_diff>